<commit_message>
make it A plus app
</commit_message>
<xml_diff>
--- a/Burke Lake Park Explorer_submittal.docx
+++ b/Burke Lake Park Explorer_submittal.docx
@@ -22,6 +22,13 @@
           <w:b/>
           <w:bCs/>
         </w:rPr>
+        <w:t xml:space="preserve">      </w:t>
+      </w:r>
+      <w:r>
+        <w:rPr>
+          <w:b/>
+          <w:bCs/>
+        </w:rPr>
         <w:t>Burke Lake Park Explorer:</w:t>
       </w:r>
     </w:p>
@@ -68,17 +75,27 @@
     </w:p>
     <w:p>
       <w:pPr>
+        <w:spacing w:after="0"/>
         <w:ind w:left="2880"/>
       </w:pPr>
       <w:r>
+        <w:t xml:space="preserve">  </w:t>
+      </w:r>
+      <w:r>
         <w:t>Henry Stepanus</w:t>
       </w:r>
     </w:p>
     <w:p>
+      <w:pPr>
+        <w:spacing w:after="0"/>
+      </w:pPr>
       <w:r>
         <w:t xml:space="preserve">                                                                 </w:t>
       </w:r>
       <w:r>
+        <w:t xml:space="preserve"> </w:t>
+      </w:r>
+      <w:r>
         <w:t>GEOG 77</w:t>
       </w:r>
       <w:r>
@@ -86,6 +103,9 @@
       </w:r>
     </w:p>
     <w:p>
+      <w:pPr>
+        <w:spacing w:after="0"/>
+      </w:pPr>
       <w:r>
         <w:t xml:space="preserve">                                        </w:t>
       </w:r>
@@ -95,6 +115,7 @@
     </w:p>
     <w:p>
       <w:pPr>
+        <w:spacing w:after="0"/>
         <w:ind w:left="2880"/>
       </w:pPr>
       <w:r>
@@ -104,8 +125,6 @@
         <w:t xml:space="preserve"> 27, 2026</w:t>
       </w:r>
     </w:p>
-    <w:p/>
-    <w:p/>
     <w:p>
       <w:pPr>
         <w:rPr>
@@ -233,34 +252,34 @@
     </w:p>
     <w:p>
       <w:r>
+        <w:t>User Stories</w:t>
+      </w:r>
+      <w:r>
+        <w:t>:</w:t>
+      </w:r>
+    </w:p>
+    <w:p>
+      <w:pPr>
+        <w:pStyle w:val="ListParagraph"/>
+        <w:numPr>
+          <w:ilvl w:val="0"/>
+          <w:numId w:val="15"/>
+        </w:numPr>
+      </w:pPr>
+      <w:r>
+        <w:t>As a visitor, I want to search for facilities, so I can quickly find restrooms and services.</w:t>
+      </w:r>
+    </w:p>
+    <w:p>
+      <w:pPr>
+        <w:pStyle w:val="ListParagraph"/>
+        <w:numPr>
+          <w:ilvl w:val="0"/>
+          <w:numId w:val="15"/>
+        </w:numPr>
+      </w:pPr>
+      <w:r>
         <w:lastRenderedPageBreak/>
-        <w:t>User Stories</w:t>
-      </w:r>
-      <w:r>
-        <w:t>:</w:t>
-      </w:r>
-    </w:p>
-    <w:p>
-      <w:pPr>
-        <w:pStyle w:val="ListParagraph"/>
-        <w:numPr>
-          <w:ilvl w:val="0"/>
-          <w:numId w:val="15"/>
-        </w:numPr>
-      </w:pPr>
-      <w:r>
-        <w:t>As a visitor, I want to search for facilities, so I can quickly find restrooms and services.</w:t>
-      </w:r>
-    </w:p>
-    <w:p>
-      <w:pPr>
-        <w:pStyle w:val="ListParagraph"/>
-        <w:numPr>
-          <w:ilvl w:val="0"/>
-          <w:numId w:val="15"/>
-        </w:numPr>
-      </w:pPr>
-      <w:r>
         <w:t>As a hiker, I want to filter trails by difficulty, so I can choose appropriate routes.</w:t>
       </w:r>
     </w:p>
@@ -430,1686 +449,18 @@
       </w:r>
     </w:p>
     <w:p>
-      <w:pPr>
-        <w:ind w:left="720"/>
-      </w:pPr>
-      <w:r>
-        <w:t>4. Device Location (Near Me)</w:t>
-      </w:r>
-    </w:p>
-    <w:p>
-      <w:pPr>
-        <w:ind w:left="720"/>
-      </w:pPr>
-      <w:r>
-        <w:t>Users can locate themselves using geolocation and center the map accordingly.</w:t>
-      </w:r>
-    </w:p>
-    <w:p>
-      <w:pPr>
-        <w:ind w:left="720"/>
-      </w:pPr>
-      <w:r>
-        <w:t>5. Layer Toggle</w:t>
-      </w:r>
-    </w:p>
-    <w:p>
-      <w:pPr>
-        <w:pStyle w:val="ListParagraph"/>
-        <w:numPr>
-          <w:ilvl w:val="0"/>
-          <w:numId w:val="4"/>
-        </w:numPr>
-        <w:ind w:left="1440"/>
-      </w:pPr>
-      <w:r>
-        <w:t>Users can enable/disable:</w:t>
-      </w:r>
-    </w:p>
-    <w:p>
-      <w:pPr>
-        <w:pStyle w:val="ListParagraph"/>
-        <w:numPr>
-          <w:ilvl w:val="0"/>
-          <w:numId w:val="4"/>
-        </w:numPr>
-        <w:ind w:left="1440"/>
-      </w:pPr>
-      <w:r>
-        <w:t>Trails</w:t>
-      </w:r>
-    </w:p>
-    <w:p>
-      <w:pPr>
-        <w:pStyle w:val="ListParagraph"/>
-        <w:numPr>
-          <w:ilvl w:val="0"/>
-          <w:numId w:val="4"/>
-        </w:numPr>
-        <w:ind w:left="1440"/>
-      </w:pPr>
-      <w:r>
-        <w:t>Facilities</w:t>
-      </w:r>
-    </w:p>
-    <w:p>
-      <w:pPr>
-        <w:pStyle w:val="ListParagraph"/>
-        <w:numPr>
-          <w:ilvl w:val="0"/>
-          <w:numId w:val="4"/>
-        </w:numPr>
-        <w:ind w:left="1440"/>
-      </w:pPr>
-      <w:r>
-        <w:t>Parking</w:t>
-      </w:r>
-    </w:p>
-    <w:p>
-      <w:pPr>
-        <w:pStyle w:val="ListParagraph"/>
-        <w:numPr>
-          <w:ilvl w:val="0"/>
-          <w:numId w:val="4"/>
-        </w:numPr>
-        <w:ind w:left="1440"/>
-      </w:pPr>
-      <w:r>
-        <w:t>Sensitive areas</w:t>
-      </w:r>
-    </w:p>
-    <w:p>
-      <w:pPr>
-        <w:pStyle w:val="ListParagraph"/>
-        <w:numPr>
-          <w:ilvl w:val="0"/>
-          <w:numId w:val="4"/>
-        </w:numPr>
-        <w:ind w:left="1440"/>
-      </w:pPr>
-      <w:r>
-        <w:lastRenderedPageBreak/>
-        <w:t>User reports</w:t>
-      </w:r>
-    </w:p>
-    <w:p>
-      <w:pPr>
-        <w:pStyle w:val="ListParagraph"/>
-      </w:pPr>
-    </w:p>
-    <w:p>
-      <w:pPr>
-        <w:rPr>
-          <w:b/>
-          <w:bCs/>
-        </w:rPr>
-      </w:pPr>
-      <w:r>
-        <w:rPr>
-          <w:b/>
-          <w:bCs/>
-        </w:rPr>
-        <w:t>4. Data Layers</w:t>
-      </w:r>
-    </w:p>
-    <w:p>
-      <w:r>
-        <w:t>The application includes at least 5 layers:</w:t>
-      </w:r>
-    </w:p>
-    <w:p>
-      <w:pPr>
-        <w:pStyle w:val="ListParagraph"/>
-        <w:numPr>
-          <w:ilvl w:val="0"/>
-          <w:numId w:val="5"/>
-        </w:numPr>
-      </w:pPr>
-      <w:r>
-        <w:t>Trails (Line)</w:t>
-      </w:r>
-    </w:p>
-    <w:p>
-      <w:pPr>
-        <w:pStyle w:val="ListParagraph"/>
-        <w:numPr>
-          <w:ilvl w:val="0"/>
-          <w:numId w:val="5"/>
-        </w:numPr>
-      </w:pPr>
-      <w:r>
-        <w:t>Digitized manually for accuracy</w:t>
-      </w:r>
-    </w:p>
-    <w:p>
-      <w:pPr>
-        <w:pStyle w:val="ListParagraph"/>
-        <w:numPr>
-          <w:ilvl w:val="0"/>
-          <w:numId w:val="5"/>
-        </w:numPr>
-      </w:pPr>
-      <w:r>
-        <w:t>Includes attributes: difficulty, surface, length</w:t>
-      </w:r>
-    </w:p>
-    <w:p>
-      <w:pPr>
-        <w:pStyle w:val="ListParagraph"/>
-        <w:numPr>
-          <w:ilvl w:val="0"/>
-          <w:numId w:val="5"/>
-        </w:numPr>
-      </w:pPr>
-      <w:r>
-        <w:t>Facilities (Point/Polygon)</w:t>
-      </w:r>
-    </w:p>
-    <w:p>
-      <w:pPr>
-        <w:pStyle w:val="ListParagraph"/>
-        <w:numPr>
-          <w:ilvl w:val="0"/>
-          <w:numId w:val="5"/>
-        </w:numPr>
-      </w:pPr>
-      <w:r>
-        <w:t>Includes restrooms, visitor centers, playgrounds</w:t>
-      </w:r>
-    </w:p>
-    <w:p>
-      <w:pPr>
-        <w:pStyle w:val="ListParagraph"/>
-        <w:numPr>
-          <w:ilvl w:val="0"/>
-          <w:numId w:val="5"/>
-        </w:numPr>
-      </w:pPr>
-      <w:r>
-        <w:t>Uses custom symbology (icons)</w:t>
-      </w:r>
-    </w:p>
-    <w:p>
-      <w:pPr>
-        <w:pStyle w:val="ListParagraph"/>
-        <w:numPr>
-          <w:ilvl w:val="0"/>
-          <w:numId w:val="5"/>
-        </w:numPr>
-      </w:pPr>
-      <w:r>
-        <w:t>Parking (Polygon)</w:t>
-      </w:r>
-    </w:p>
-    <w:p>
-      <w:pPr>
-        <w:pStyle w:val="ListParagraph"/>
-        <w:numPr>
-          <w:ilvl w:val="0"/>
-          <w:numId w:val="5"/>
-        </w:numPr>
-      </w:pPr>
-      <w:r>
-        <w:t>Represents parking areas with capacity attributes</w:t>
-      </w:r>
-    </w:p>
-    <w:p>
-      <w:pPr>
-        <w:pStyle w:val="ListParagraph"/>
-        <w:numPr>
-          <w:ilvl w:val="0"/>
-          <w:numId w:val="5"/>
-        </w:numPr>
-      </w:pPr>
-      <w:r>
-        <w:t>Sensitive Areas (Polygon)</w:t>
-      </w:r>
-    </w:p>
-    <w:p>
-      <w:pPr>
-        <w:pStyle w:val="ListParagraph"/>
-        <w:numPr>
-          <w:ilvl w:val="0"/>
-          <w:numId w:val="5"/>
-        </w:numPr>
-      </w:pPr>
-      <w:r>
-        <w:t>Includes ecological or restricted zones</w:t>
-      </w:r>
-    </w:p>
-    <w:p>
-      <w:pPr>
-        <w:pStyle w:val="ListParagraph"/>
-        <w:numPr>
-          <w:ilvl w:val="0"/>
-          <w:numId w:val="5"/>
-        </w:numPr>
-      </w:pPr>
-      <w:r>
-        <w:t>User Reports (Point)</w:t>
-      </w:r>
-    </w:p>
-    <w:p>
-      <w:pPr>
-        <w:pStyle w:val="ListParagraph"/>
-        <w:numPr>
-          <w:ilvl w:val="0"/>
-          <w:numId w:val="5"/>
-        </w:numPr>
-      </w:pPr>
-      <w:r>
-        <w:t>User-generated data layer</w:t>
-      </w:r>
-    </w:p>
-    <w:p>
-      <w:pPr>
-        <w:pStyle w:val="ListParagraph"/>
-        <w:numPr>
-          <w:ilvl w:val="0"/>
-          <w:numId w:val="5"/>
-        </w:numPr>
-      </w:pPr>
-      <w:r>
-        <w:t>Basemap (OpenStreetMap)</w:t>
-      </w:r>
-    </w:p>
-    <w:p>
-      <w:pPr>
-        <w:pStyle w:val="ListParagraph"/>
-        <w:numPr>
-          <w:ilvl w:val="0"/>
-          <w:numId w:val="5"/>
-        </w:numPr>
-      </w:pPr>
-      <w:r>
-        <w:t>Provides geographic context</w:t>
-      </w:r>
-    </w:p>
-    <w:p>
-      <w:pPr>
-        <w:rPr>
-          <w:b/>
-          <w:bCs/>
-        </w:rPr>
-      </w:pPr>
-    </w:p>
-    <w:p>
-      <w:pPr>
-        <w:rPr>
-          <w:b/>
-          <w:bCs/>
-        </w:rPr>
-      </w:pPr>
-      <w:r>
-        <w:rPr>
-          <w:b/>
-          <w:bCs/>
-        </w:rPr>
-        <w:t>5. Data Collection and Processing</w:t>
-      </w:r>
-    </w:p>
-    <w:p>
-      <w:r>
-        <w:t xml:space="preserve">Initial data was created using approximate </w:t>
-      </w:r>
-      <w:proofErr w:type="spellStart"/>
-      <w:r>
-        <w:t>GeoJSON</w:t>
-      </w:r>
-      <w:proofErr w:type="spellEnd"/>
-      <w:r>
-        <w:t xml:space="preserve"> layers.</w:t>
-      </w:r>
-    </w:p>
-    <w:p>
-      <w:r>
-        <w:t>To improve spatial accuracy, features such as trails, facilities, and parking were:</w:t>
-      </w:r>
-    </w:p>
-    <w:p>
-      <w:pPr>
-        <w:pStyle w:val="ListParagraph"/>
-        <w:numPr>
-          <w:ilvl w:val="0"/>
-          <w:numId w:val="6"/>
-        </w:numPr>
-      </w:pPr>
-      <w:r>
-        <w:t xml:space="preserve">Digitized manually using </w:t>
-      </w:r>
-      <w:proofErr w:type="spellStart"/>
-      <w:r>
-        <w:t>umap</w:t>
-      </w:r>
-      <w:proofErr w:type="spellEnd"/>
-      <w:r>
-        <w:t xml:space="preserve"> software on </w:t>
-      </w:r>
-      <w:proofErr w:type="spellStart"/>
-      <w:r>
-        <w:t>openstreetmap</w:t>
-      </w:r>
-      <w:proofErr w:type="spellEnd"/>
-      <w:r>
-        <w:t xml:space="preserve"> </w:t>
-      </w:r>
-    </w:p>
-    <w:p>
-      <w:pPr>
-        <w:pStyle w:val="ListParagraph"/>
-        <w:numPr>
-          <w:ilvl w:val="0"/>
-          <w:numId w:val="6"/>
-        </w:numPr>
-      </w:pPr>
-      <w:r>
-        <w:t xml:space="preserve">Cleaned and structured into </w:t>
-      </w:r>
-      <w:proofErr w:type="spellStart"/>
-      <w:r>
-        <w:t>GeoJSON</w:t>
-      </w:r>
-      <w:proofErr w:type="spellEnd"/>
-      <w:r>
-        <w:t xml:space="preserve"> format</w:t>
-      </w:r>
-    </w:p>
-    <w:p>
-      <w:pPr>
-        <w:pStyle w:val="ListParagraph"/>
-        <w:numPr>
-          <w:ilvl w:val="0"/>
-          <w:numId w:val="6"/>
-        </w:numPr>
-      </w:pPr>
-      <w:r>
-        <w:t>Standardized with consistent attributes</w:t>
-      </w:r>
-    </w:p>
-    <w:p>
-      <w:r>
-        <w:t>This significantly improved the realism and usability of the application.</w:t>
-      </w:r>
-    </w:p>
-    <w:p/>
-    <w:p>
-      <w:pPr>
-        <w:rPr>
-          <w:b/>
-          <w:bCs/>
-        </w:rPr>
-      </w:pPr>
-      <w:r>
-        <w:rPr>
-          <w:b/>
-          <w:bCs/>
-        </w:rPr>
-        <w:t>6. Backend Design (ER Diagram &amp; Logical Schema)</w:t>
-      </w:r>
-    </w:p>
-    <w:p>
-      <w:r>
-        <w:t>Although the deployed version runs on GitHub Pages (frontend only), the application is designed to integrate with a backend system using PostgreSQL/</w:t>
-      </w:r>
-      <w:proofErr w:type="spellStart"/>
-      <w:r>
-        <w:t>PostGIS</w:t>
-      </w:r>
-      <w:proofErr w:type="spellEnd"/>
-      <w:r>
-        <w:t>.</w:t>
-      </w:r>
-    </w:p>
-    <w:p>
-      <w:pPr>
-        <w:pStyle w:val="ListParagraph"/>
-        <w:numPr>
-          <w:ilvl w:val="0"/>
-          <w:numId w:val="13"/>
-        </w:numPr>
-      </w:pPr>
-      <w:r>
-        <w:t>Entities</w:t>
-      </w:r>
-    </w:p>
-    <w:p>
-      <w:pPr>
-        <w:pStyle w:val="ListParagraph"/>
-        <w:numPr>
-          <w:ilvl w:val="0"/>
-          <w:numId w:val="13"/>
-        </w:numPr>
-      </w:pPr>
-      <w:r>
-        <w:lastRenderedPageBreak/>
-        <w:t>Park</w:t>
-      </w:r>
-    </w:p>
-    <w:p>
-      <w:pPr>
-        <w:pStyle w:val="ListParagraph"/>
-        <w:numPr>
-          <w:ilvl w:val="0"/>
-          <w:numId w:val="13"/>
-        </w:numPr>
-      </w:pPr>
-      <w:r>
-        <w:t>Trail</w:t>
-      </w:r>
-    </w:p>
-    <w:p>
-      <w:pPr>
-        <w:pStyle w:val="ListParagraph"/>
-        <w:numPr>
-          <w:ilvl w:val="0"/>
-          <w:numId w:val="13"/>
-        </w:numPr>
-      </w:pPr>
-      <w:r>
-        <w:t>Facility</w:t>
-      </w:r>
-    </w:p>
-    <w:p>
-      <w:pPr>
-        <w:pStyle w:val="ListParagraph"/>
-        <w:numPr>
-          <w:ilvl w:val="0"/>
-          <w:numId w:val="13"/>
-        </w:numPr>
-      </w:pPr>
-      <w:r>
-        <w:t>Parking</w:t>
-      </w:r>
-    </w:p>
-    <w:p>
-      <w:pPr>
-        <w:pStyle w:val="ListParagraph"/>
-        <w:numPr>
-          <w:ilvl w:val="0"/>
-          <w:numId w:val="13"/>
-        </w:numPr>
-      </w:pPr>
-      <w:r>
-        <w:t>Sensitive Area</w:t>
-      </w:r>
-    </w:p>
-    <w:p>
-      <w:pPr>
-        <w:pStyle w:val="ListParagraph"/>
-        <w:numPr>
-          <w:ilvl w:val="0"/>
-          <w:numId w:val="13"/>
-        </w:numPr>
-      </w:pPr>
-      <w:r>
-        <w:t>User Report</w:t>
-      </w:r>
-    </w:p>
-    <w:p>
-      <w:pPr>
-        <w:pStyle w:val="ListParagraph"/>
-        <w:numPr>
-          <w:ilvl w:val="0"/>
-          <w:numId w:val="13"/>
-        </w:numPr>
-      </w:pPr>
-      <w:r>
-        <w:t xml:space="preserve">Logical Schema </w:t>
-      </w:r>
-    </w:p>
-    <w:p>
-      <w:pPr>
-        <w:spacing w:after="0"/>
-        <w:rPr>
-          <w:i/>
-          <w:iCs/>
-          <w:sz w:val="20"/>
-          <w:szCs w:val="20"/>
-        </w:rPr>
-      </w:pPr>
-    </w:p>
-    <w:p>
-      <w:pPr>
-        <w:spacing w:after="0"/>
-        <w:rPr>
-          <w:i/>
-          <w:iCs/>
-          <w:sz w:val="20"/>
-          <w:szCs w:val="20"/>
-        </w:rPr>
-      </w:pPr>
-      <w:r>
-        <w:rPr>
-          <w:i/>
-          <w:iCs/>
-          <w:sz w:val="20"/>
-          <w:szCs w:val="20"/>
-        </w:rPr>
-        <w:t>park (</w:t>
-      </w:r>
-    </w:p>
-    <w:p>
-      <w:pPr>
-        <w:spacing w:after="0"/>
-        <w:rPr>
-          <w:i/>
-          <w:iCs/>
-          <w:sz w:val="20"/>
-          <w:szCs w:val="20"/>
-        </w:rPr>
-      </w:pPr>
-      <w:r>
-        <w:rPr>
-          <w:i/>
-          <w:iCs/>
-          <w:sz w:val="20"/>
-          <w:szCs w:val="20"/>
-        </w:rPr>
-        <w:t xml:space="preserve">  </w:t>
-      </w:r>
-      <w:proofErr w:type="spellStart"/>
-      <w:r>
-        <w:rPr>
-          <w:i/>
-          <w:iCs/>
-          <w:sz w:val="20"/>
-          <w:szCs w:val="20"/>
-        </w:rPr>
-        <w:t>park_id</w:t>
-      </w:r>
-      <w:proofErr w:type="spellEnd"/>
-      <w:r>
-        <w:rPr>
-          <w:i/>
-          <w:iCs/>
-          <w:sz w:val="20"/>
-          <w:szCs w:val="20"/>
-        </w:rPr>
-        <w:t xml:space="preserve"> PK,</w:t>
-      </w:r>
-    </w:p>
-    <w:p>
-      <w:pPr>
-        <w:spacing w:after="0"/>
-        <w:rPr>
-          <w:i/>
-          <w:iCs/>
-          <w:sz w:val="20"/>
-          <w:szCs w:val="20"/>
-        </w:rPr>
-      </w:pPr>
-      <w:r>
-        <w:rPr>
-          <w:i/>
-          <w:iCs/>
-          <w:sz w:val="20"/>
-          <w:szCs w:val="20"/>
-        </w:rPr>
-        <w:t xml:space="preserve">  name,</w:t>
-      </w:r>
-    </w:p>
-    <w:p>
-      <w:pPr>
-        <w:spacing w:after="0"/>
-        <w:rPr>
-          <w:i/>
-          <w:iCs/>
-          <w:sz w:val="20"/>
-          <w:szCs w:val="20"/>
-        </w:rPr>
-      </w:pPr>
-      <w:r>
-        <w:rPr>
-          <w:i/>
-          <w:iCs/>
-          <w:sz w:val="20"/>
-          <w:szCs w:val="20"/>
-        </w:rPr>
-        <w:t xml:space="preserve">  location</w:t>
-      </w:r>
-    </w:p>
-    <w:p>
-      <w:pPr>
-        <w:spacing w:after="0"/>
-        <w:rPr>
-          <w:i/>
-          <w:iCs/>
-          <w:sz w:val="20"/>
-          <w:szCs w:val="20"/>
-        </w:rPr>
-      </w:pPr>
-      <w:r>
-        <w:rPr>
-          <w:i/>
-          <w:iCs/>
-          <w:sz w:val="20"/>
-          <w:szCs w:val="20"/>
-        </w:rPr>
-        <w:t>)</w:t>
-      </w:r>
-    </w:p>
-    <w:p>
-      <w:pPr>
-        <w:rPr>
-          <w:sz w:val="20"/>
-          <w:szCs w:val="20"/>
-        </w:rPr>
-      </w:pPr>
-    </w:p>
-    <w:p>
-      <w:pPr>
-        <w:spacing w:after="0"/>
-        <w:rPr>
-          <w:i/>
-          <w:iCs/>
-          <w:sz w:val="20"/>
-          <w:szCs w:val="20"/>
-        </w:rPr>
-      </w:pPr>
-      <w:r>
-        <w:rPr>
-          <w:i/>
-          <w:iCs/>
-          <w:sz w:val="20"/>
-          <w:szCs w:val="20"/>
-        </w:rPr>
-        <w:t>trail (</w:t>
-      </w:r>
-    </w:p>
-    <w:p>
-      <w:pPr>
-        <w:spacing w:after="0"/>
-        <w:rPr>
-          <w:i/>
-          <w:iCs/>
-          <w:sz w:val="20"/>
-          <w:szCs w:val="20"/>
-        </w:rPr>
-      </w:pPr>
-      <w:r>
-        <w:rPr>
-          <w:i/>
-          <w:iCs/>
-          <w:sz w:val="20"/>
-          <w:szCs w:val="20"/>
-        </w:rPr>
-        <w:t xml:space="preserve">  </w:t>
-      </w:r>
-      <w:proofErr w:type="spellStart"/>
-      <w:r>
-        <w:rPr>
-          <w:i/>
-          <w:iCs/>
-          <w:sz w:val="20"/>
-          <w:szCs w:val="20"/>
-        </w:rPr>
-        <w:t>trail_id</w:t>
-      </w:r>
-      <w:proofErr w:type="spellEnd"/>
-      <w:r>
-        <w:rPr>
-          <w:i/>
-          <w:iCs/>
-          <w:sz w:val="20"/>
-          <w:szCs w:val="20"/>
-        </w:rPr>
-        <w:t xml:space="preserve"> PK,</w:t>
-      </w:r>
-    </w:p>
-    <w:p>
-      <w:pPr>
-        <w:spacing w:after="0"/>
-        <w:rPr>
-          <w:i/>
-          <w:iCs/>
-          <w:sz w:val="20"/>
-          <w:szCs w:val="20"/>
-        </w:rPr>
-      </w:pPr>
-      <w:r>
-        <w:rPr>
-          <w:i/>
-          <w:iCs/>
-          <w:sz w:val="20"/>
-          <w:szCs w:val="20"/>
-        </w:rPr>
-        <w:t xml:space="preserve">  </w:t>
-      </w:r>
-      <w:proofErr w:type="spellStart"/>
-      <w:r>
-        <w:rPr>
-          <w:i/>
-          <w:iCs/>
-          <w:sz w:val="20"/>
-          <w:szCs w:val="20"/>
-        </w:rPr>
-        <w:t>park_id</w:t>
-      </w:r>
-      <w:proofErr w:type="spellEnd"/>
-      <w:r>
-        <w:rPr>
-          <w:i/>
-          <w:iCs/>
-          <w:sz w:val="20"/>
-          <w:szCs w:val="20"/>
-        </w:rPr>
-        <w:t xml:space="preserve"> FK,</w:t>
-      </w:r>
-    </w:p>
-    <w:p>
-      <w:pPr>
-        <w:spacing w:after="0"/>
-        <w:rPr>
-          <w:i/>
-          <w:iCs/>
-          <w:sz w:val="20"/>
-          <w:szCs w:val="20"/>
-        </w:rPr>
-      </w:pPr>
-      <w:r>
-        <w:rPr>
-          <w:i/>
-          <w:iCs/>
-          <w:sz w:val="20"/>
-          <w:szCs w:val="20"/>
-        </w:rPr>
-        <w:t xml:space="preserve">  name,</w:t>
-      </w:r>
-    </w:p>
-    <w:p>
-      <w:pPr>
-        <w:spacing w:after="0"/>
-        <w:rPr>
-          <w:i/>
-          <w:iCs/>
-          <w:sz w:val="20"/>
-          <w:szCs w:val="20"/>
-        </w:rPr>
-      </w:pPr>
-      <w:r>
-        <w:rPr>
-          <w:i/>
-          <w:iCs/>
-          <w:sz w:val="20"/>
-          <w:szCs w:val="20"/>
-        </w:rPr>
-        <w:t xml:space="preserve">  difficulty,</w:t>
-      </w:r>
-    </w:p>
-    <w:p>
-      <w:pPr>
-        <w:spacing w:after="0"/>
-        <w:rPr>
-          <w:i/>
-          <w:iCs/>
-          <w:sz w:val="20"/>
-          <w:szCs w:val="20"/>
-        </w:rPr>
-      </w:pPr>
-      <w:r>
-        <w:rPr>
-          <w:i/>
-          <w:iCs/>
-          <w:sz w:val="20"/>
-          <w:szCs w:val="20"/>
-        </w:rPr>
-        <w:t xml:space="preserve">  </w:t>
-      </w:r>
-      <w:proofErr w:type="spellStart"/>
-      <w:r>
-        <w:rPr>
-          <w:i/>
-          <w:iCs/>
-          <w:sz w:val="20"/>
-          <w:szCs w:val="20"/>
-        </w:rPr>
-        <w:t>length_mi</w:t>
-      </w:r>
-      <w:proofErr w:type="spellEnd"/>
-      <w:r>
-        <w:rPr>
-          <w:i/>
-          <w:iCs/>
-          <w:sz w:val="20"/>
-          <w:szCs w:val="20"/>
-        </w:rPr>
-        <w:t>,</w:t>
-      </w:r>
-    </w:p>
-    <w:p>
-      <w:pPr>
-        <w:spacing w:after="0"/>
-        <w:rPr>
-          <w:i/>
-          <w:iCs/>
-          <w:sz w:val="20"/>
-          <w:szCs w:val="20"/>
-        </w:rPr>
-      </w:pPr>
-      <w:r>
-        <w:rPr>
-          <w:i/>
-          <w:iCs/>
-          <w:sz w:val="20"/>
-          <w:szCs w:val="20"/>
-        </w:rPr>
-        <w:t xml:space="preserve">  </w:t>
-      </w:r>
-      <w:proofErr w:type="spellStart"/>
-      <w:r>
-        <w:rPr>
-          <w:i/>
-          <w:iCs/>
-          <w:sz w:val="20"/>
-          <w:szCs w:val="20"/>
-        </w:rPr>
-        <w:t>geom</w:t>
-      </w:r>
-      <w:proofErr w:type="spellEnd"/>
-    </w:p>
-    <w:p>
-      <w:pPr>
-        <w:spacing w:after="0"/>
-        <w:rPr>
-          <w:i/>
-          <w:iCs/>
-          <w:sz w:val="20"/>
-          <w:szCs w:val="20"/>
-        </w:rPr>
-      </w:pPr>
-      <w:r>
-        <w:rPr>
-          <w:i/>
-          <w:iCs/>
-          <w:sz w:val="20"/>
-          <w:szCs w:val="20"/>
-        </w:rPr>
-        <w:t>)</w:t>
-      </w:r>
-    </w:p>
-    <w:p>
-      <w:pPr>
-        <w:spacing w:after="0"/>
-        <w:rPr>
-          <w:i/>
-          <w:iCs/>
-          <w:sz w:val="20"/>
-          <w:szCs w:val="20"/>
-        </w:rPr>
-      </w:pPr>
-    </w:p>
-    <w:p>
-      <w:pPr>
-        <w:spacing w:after="0"/>
-        <w:rPr>
-          <w:i/>
-          <w:iCs/>
-          <w:sz w:val="20"/>
-          <w:szCs w:val="20"/>
-        </w:rPr>
-      </w:pPr>
-    </w:p>
-    <w:p>
-      <w:pPr>
-        <w:spacing w:after="0"/>
-        <w:rPr>
-          <w:i/>
-          <w:iCs/>
-          <w:sz w:val="20"/>
-          <w:szCs w:val="20"/>
-        </w:rPr>
-      </w:pPr>
-      <w:r>
-        <w:rPr>
-          <w:i/>
-          <w:iCs/>
-          <w:sz w:val="20"/>
-          <w:szCs w:val="20"/>
-        </w:rPr>
-        <w:t>facility (</w:t>
-      </w:r>
-    </w:p>
-    <w:p>
-      <w:pPr>
-        <w:spacing w:after="0"/>
-        <w:rPr>
-          <w:i/>
-          <w:iCs/>
-          <w:sz w:val="20"/>
-          <w:szCs w:val="20"/>
-        </w:rPr>
-      </w:pPr>
-      <w:r>
-        <w:rPr>
-          <w:i/>
-          <w:iCs/>
-          <w:sz w:val="20"/>
-          <w:szCs w:val="20"/>
-        </w:rPr>
-        <w:t xml:space="preserve">  </w:t>
-      </w:r>
-      <w:proofErr w:type="spellStart"/>
-      <w:r>
-        <w:rPr>
-          <w:i/>
-          <w:iCs/>
-          <w:sz w:val="20"/>
-          <w:szCs w:val="20"/>
-        </w:rPr>
-        <w:t>facility_id</w:t>
-      </w:r>
-      <w:proofErr w:type="spellEnd"/>
-      <w:r>
-        <w:rPr>
-          <w:i/>
-          <w:iCs/>
-          <w:sz w:val="20"/>
-          <w:szCs w:val="20"/>
-        </w:rPr>
-        <w:t xml:space="preserve"> PK,</w:t>
-      </w:r>
-    </w:p>
-    <w:p>
-      <w:pPr>
-        <w:spacing w:after="0"/>
-        <w:rPr>
-          <w:i/>
-          <w:iCs/>
-          <w:sz w:val="20"/>
-          <w:szCs w:val="20"/>
-        </w:rPr>
-      </w:pPr>
-      <w:r>
-        <w:rPr>
-          <w:i/>
-          <w:iCs/>
-          <w:sz w:val="20"/>
-          <w:szCs w:val="20"/>
-        </w:rPr>
-        <w:t xml:space="preserve">  </w:t>
-      </w:r>
-      <w:proofErr w:type="spellStart"/>
-      <w:r>
-        <w:rPr>
-          <w:i/>
-          <w:iCs/>
-          <w:sz w:val="20"/>
-          <w:szCs w:val="20"/>
-        </w:rPr>
-        <w:t>park_id</w:t>
-      </w:r>
-      <w:proofErr w:type="spellEnd"/>
-      <w:r>
-        <w:rPr>
-          <w:i/>
-          <w:iCs/>
-          <w:sz w:val="20"/>
-          <w:szCs w:val="20"/>
-        </w:rPr>
-        <w:t xml:space="preserve"> FK,</w:t>
-      </w:r>
-    </w:p>
-    <w:p>
-      <w:pPr>
-        <w:spacing w:after="0"/>
-        <w:rPr>
-          <w:i/>
-          <w:iCs/>
-          <w:sz w:val="20"/>
-          <w:szCs w:val="20"/>
-        </w:rPr>
-      </w:pPr>
-      <w:r>
-        <w:rPr>
-          <w:i/>
-          <w:iCs/>
-          <w:sz w:val="20"/>
-          <w:szCs w:val="20"/>
-        </w:rPr>
-        <w:t xml:space="preserve">  name,</w:t>
-      </w:r>
-    </w:p>
-    <w:p>
-      <w:pPr>
-        <w:spacing w:after="0"/>
-        <w:rPr>
-          <w:i/>
-          <w:iCs/>
-          <w:sz w:val="20"/>
-          <w:szCs w:val="20"/>
-        </w:rPr>
-      </w:pPr>
-      <w:r>
-        <w:rPr>
-          <w:i/>
-          <w:iCs/>
-          <w:sz w:val="20"/>
-          <w:szCs w:val="20"/>
-        </w:rPr>
-        <w:t xml:space="preserve">  type,</w:t>
-      </w:r>
-    </w:p>
-    <w:p>
-      <w:pPr>
-        <w:spacing w:after="0"/>
-        <w:rPr>
-          <w:i/>
-          <w:iCs/>
-          <w:sz w:val="20"/>
-          <w:szCs w:val="20"/>
-        </w:rPr>
-      </w:pPr>
-      <w:r>
-        <w:rPr>
-          <w:i/>
-          <w:iCs/>
-          <w:sz w:val="20"/>
-          <w:szCs w:val="20"/>
-        </w:rPr>
-        <w:t xml:space="preserve">  </w:t>
-      </w:r>
-      <w:proofErr w:type="spellStart"/>
-      <w:r>
-        <w:rPr>
-          <w:i/>
-          <w:iCs/>
-          <w:sz w:val="20"/>
-          <w:szCs w:val="20"/>
-        </w:rPr>
-        <w:t>geom</w:t>
-      </w:r>
-      <w:proofErr w:type="spellEnd"/>
-    </w:p>
-    <w:p>
-      <w:pPr>
-        <w:spacing w:after="0"/>
-        <w:rPr>
-          <w:i/>
-          <w:iCs/>
-          <w:sz w:val="20"/>
-          <w:szCs w:val="20"/>
-        </w:rPr>
-      </w:pPr>
-      <w:r>
-        <w:rPr>
-          <w:i/>
-          <w:iCs/>
-          <w:sz w:val="20"/>
-          <w:szCs w:val="20"/>
-        </w:rPr>
-        <w:t>)</w:t>
-      </w:r>
-    </w:p>
-    <w:p>
-      <w:pPr>
-        <w:rPr>
-          <w:sz w:val="20"/>
-          <w:szCs w:val="20"/>
-        </w:rPr>
-      </w:pPr>
-    </w:p>
-    <w:p>
-      <w:pPr>
-        <w:spacing w:after="0"/>
-        <w:rPr>
-          <w:i/>
-          <w:iCs/>
-          <w:sz w:val="20"/>
-          <w:szCs w:val="20"/>
-        </w:rPr>
-      </w:pPr>
-      <w:r>
-        <w:rPr>
-          <w:i/>
-          <w:iCs/>
-          <w:sz w:val="20"/>
-          <w:szCs w:val="20"/>
-        </w:rPr>
-        <w:t>parking (</w:t>
-      </w:r>
-    </w:p>
-    <w:p>
-      <w:pPr>
-        <w:spacing w:after="0"/>
-        <w:rPr>
-          <w:i/>
-          <w:iCs/>
-          <w:sz w:val="20"/>
-          <w:szCs w:val="20"/>
-        </w:rPr>
-      </w:pPr>
-      <w:r>
-        <w:rPr>
-          <w:i/>
-          <w:iCs/>
-          <w:sz w:val="20"/>
-          <w:szCs w:val="20"/>
-        </w:rPr>
-        <w:t xml:space="preserve">  </w:t>
-      </w:r>
-      <w:proofErr w:type="spellStart"/>
-      <w:r>
-        <w:rPr>
-          <w:i/>
-          <w:iCs/>
-          <w:sz w:val="20"/>
-          <w:szCs w:val="20"/>
-        </w:rPr>
-        <w:t>parking_id</w:t>
-      </w:r>
-      <w:proofErr w:type="spellEnd"/>
-      <w:r>
-        <w:rPr>
-          <w:i/>
-          <w:iCs/>
-          <w:sz w:val="20"/>
-          <w:szCs w:val="20"/>
-        </w:rPr>
-        <w:t xml:space="preserve"> PK,</w:t>
-      </w:r>
-    </w:p>
-    <w:p>
-      <w:pPr>
-        <w:spacing w:after="0"/>
-        <w:rPr>
-          <w:i/>
-          <w:iCs/>
-          <w:sz w:val="20"/>
-          <w:szCs w:val="20"/>
-        </w:rPr>
-      </w:pPr>
-      <w:r>
-        <w:rPr>
-          <w:i/>
-          <w:iCs/>
-          <w:sz w:val="20"/>
-          <w:szCs w:val="20"/>
-        </w:rPr>
-        <w:t xml:space="preserve">  </w:t>
-      </w:r>
-      <w:proofErr w:type="spellStart"/>
-      <w:r>
-        <w:rPr>
-          <w:i/>
-          <w:iCs/>
-          <w:sz w:val="20"/>
-          <w:szCs w:val="20"/>
-        </w:rPr>
-        <w:t>park_id</w:t>
-      </w:r>
-      <w:proofErr w:type="spellEnd"/>
-      <w:r>
-        <w:rPr>
-          <w:i/>
-          <w:iCs/>
-          <w:sz w:val="20"/>
-          <w:szCs w:val="20"/>
-        </w:rPr>
-        <w:t xml:space="preserve"> FK,</w:t>
-      </w:r>
-    </w:p>
-    <w:p>
-      <w:pPr>
-        <w:spacing w:after="0"/>
-        <w:rPr>
-          <w:i/>
-          <w:iCs/>
-          <w:sz w:val="20"/>
-          <w:szCs w:val="20"/>
-        </w:rPr>
-      </w:pPr>
-      <w:r>
-        <w:rPr>
-          <w:i/>
-          <w:iCs/>
-          <w:sz w:val="20"/>
-          <w:szCs w:val="20"/>
-        </w:rPr>
-        <w:t xml:space="preserve">  capacity,</w:t>
-      </w:r>
-    </w:p>
-    <w:p>
-      <w:pPr>
-        <w:spacing w:after="0"/>
-        <w:rPr>
-          <w:i/>
-          <w:iCs/>
-          <w:sz w:val="20"/>
-          <w:szCs w:val="20"/>
-        </w:rPr>
-      </w:pPr>
-      <w:r>
-        <w:rPr>
-          <w:i/>
-          <w:iCs/>
-          <w:sz w:val="20"/>
-          <w:szCs w:val="20"/>
-        </w:rPr>
-        <w:t xml:space="preserve">  </w:t>
-      </w:r>
-      <w:proofErr w:type="spellStart"/>
-      <w:r>
-        <w:rPr>
-          <w:i/>
-          <w:iCs/>
-          <w:sz w:val="20"/>
-          <w:szCs w:val="20"/>
-        </w:rPr>
-        <w:t>geom</w:t>
-      </w:r>
-      <w:proofErr w:type="spellEnd"/>
-    </w:p>
-    <w:p>
-      <w:pPr>
-        <w:spacing w:after="0"/>
-        <w:rPr>
-          <w:i/>
-          <w:iCs/>
-          <w:sz w:val="20"/>
-          <w:szCs w:val="20"/>
-        </w:rPr>
-      </w:pPr>
-      <w:r>
-        <w:rPr>
-          <w:i/>
-          <w:iCs/>
-          <w:sz w:val="20"/>
-          <w:szCs w:val="20"/>
-        </w:rPr>
-        <w:t>)</w:t>
-      </w:r>
-    </w:p>
-    <w:p>
-      <w:pPr>
-        <w:rPr>
-          <w:sz w:val="20"/>
-          <w:szCs w:val="20"/>
-        </w:rPr>
-      </w:pPr>
-    </w:p>
-    <w:p>
-      <w:pPr>
-        <w:spacing w:after="0"/>
-        <w:rPr>
-          <w:i/>
-          <w:iCs/>
-          <w:sz w:val="20"/>
-          <w:szCs w:val="20"/>
-        </w:rPr>
-      </w:pPr>
-      <w:proofErr w:type="spellStart"/>
-      <w:r>
-        <w:rPr>
-          <w:i/>
-          <w:iCs/>
-          <w:sz w:val="20"/>
-          <w:szCs w:val="20"/>
-        </w:rPr>
-        <w:t>user_report</w:t>
-      </w:r>
-      <w:proofErr w:type="spellEnd"/>
-      <w:r>
-        <w:rPr>
-          <w:i/>
-          <w:iCs/>
-          <w:sz w:val="20"/>
-          <w:szCs w:val="20"/>
-        </w:rPr>
-        <w:t xml:space="preserve"> (</w:t>
-      </w:r>
-    </w:p>
-    <w:p>
-      <w:pPr>
-        <w:spacing w:after="0"/>
-        <w:rPr>
-          <w:i/>
-          <w:iCs/>
-          <w:sz w:val="20"/>
-          <w:szCs w:val="20"/>
-        </w:rPr>
-      </w:pPr>
-      <w:r>
-        <w:rPr>
-          <w:i/>
-          <w:iCs/>
-          <w:sz w:val="20"/>
-          <w:szCs w:val="20"/>
-        </w:rPr>
-        <w:t xml:space="preserve">  </w:t>
-      </w:r>
-      <w:proofErr w:type="spellStart"/>
-      <w:r>
-        <w:rPr>
-          <w:i/>
-          <w:iCs/>
-          <w:sz w:val="20"/>
-          <w:szCs w:val="20"/>
-        </w:rPr>
-        <w:t>report_id</w:t>
-      </w:r>
-      <w:proofErr w:type="spellEnd"/>
-      <w:r>
-        <w:rPr>
-          <w:i/>
-          <w:iCs/>
-          <w:sz w:val="20"/>
-          <w:szCs w:val="20"/>
-        </w:rPr>
-        <w:t xml:space="preserve"> PK,</w:t>
-      </w:r>
-    </w:p>
-    <w:p>
-      <w:pPr>
-        <w:spacing w:after="0"/>
-        <w:rPr>
-          <w:i/>
-          <w:iCs/>
-          <w:sz w:val="20"/>
-          <w:szCs w:val="20"/>
-        </w:rPr>
-      </w:pPr>
-      <w:r>
-        <w:rPr>
-          <w:i/>
-          <w:iCs/>
-          <w:sz w:val="20"/>
-          <w:szCs w:val="20"/>
-        </w:rPr>
-        <w:lastRenderedPageBreak/>
-        <w:t xml:space="preserve">  </w:t>
-      </w:r>
-      <w:proofErr w:type="spellStart"/>
-      <w:r>
-        <w:rPr>
-          <w:i/>
-          <w:iCs/>
-          <w:sz w:val="20"/>
-          <w:szCs w:val="20"/>
-        </w:rPr>
-        <w:t>park_id</w:t>
-      </w:r>
-      <w:proofErr w:type="spellEnd"/>
-      <w:r>
-        <w:rPr>
-          <w:i/>
-          <w:iCs/>
-          <w:sz w:val="20"/>
-          <w:szCs w:val="20"/>
-        </w:rPr>
-        <w:t xml:space="preserve"> FK,</w:t>
-      </w:r>
-    </w:p>
-    <w:p>
-      <w:pPr>
-        <w:spacing w:after="0"/>
-        <w:rPr>
-          <w:i/>
-          <w:iCs/>
-          <w:sz w:val="20"/>
-          <w:szCs w:val="20"/>
-        </w:rPr>
-      </w:pPr>
-      <w:r>
-        <w:rPr>
-          <w:i/>
-          <w:iCs/>
-          <w:sz w:val="20"/>
-          <w:szCs w:val="20"/>
-        </w:rPr>
-        <w:t xml:space="preserve">  category,</w:t>
-      </w:r>
-    </w:p>
-    <w:p>
-      <w:pPr>
-        <w:spacing w:after="0"/>
-        <w:rPr>
-          <w:i/>
-          <w:iCs/>
-          <w:sz w:val="20"/>
-          <w:szCs w:val="20"/>
-        </w:rPr>
-      </w:pPr>
-      <w:r>
-        <w:rPr>
-          <w:i/>
-          <w:iCs/>
-          <w:sz w:val="20"/>
-          <w:szCs w:val="20"/>
-        </w:rPr>
-        <w:t xml:space="preserve">  description,</w:t>
-      </w:r>
-    </w:p>
-    <w:p>
-      <w:pPr>
-        <w:spacing w:after="0"/>
-        <w:rPr>
-          <w:i/>
-          <w:iCs/>
-          <w:sz w:val="20"/>
-          <w:szCs w:val="20"/>
-        </w:rPr>
-      </w:pPr>
-      <w:r>
-        <w:rPr>
-          <w:i/>
-          <w:iCs/>
-          <w:sz w:val="20"/>
-          <w:szCs w:val="20"/>
-        </w:rPr>
-        <w:t xml:space="preserve">  </w:t>
-      </w:r>
-      <w:proofErr w:type="spellStart"/>
-      <w:r>
-        <w:rPr>
-          <w:i/>
-          <w:iCs/>
-          <w:sz w:val="20"/>
-          <w:szCs w:val="20"/>
-        </w:rPr>
-        <w:t>photo_url</w:t>
-      </w:r>
-      <w:proofErr w:type="spellEnd"/>
-      <w:r>
-        <w:rPr>
-          <w:i/>
-          <w:iCs/>
-          <w:sz w:val="20"/>
-          <w:szCs w:val="20"/>
-        </w:rPr>
-        <w:t>,</w:t>
-      </w:r>
-    </w:p>
-    <w:p>
-      <w:pPr>
-        <w:spacing w:after="0"/>
-        <w:rPr>
-          <w:i/>
-          <w:iCs/>
-          <w:sz w:val="20"/>
-          <w:szCs w:val="20"/>
-        </w:rPr>
-      </w:pPr>
-      <w:r>
-        <w:rPr>
-          <w:i/>
-          <w:iCs/>
-          <w:sz w:val="20"/>
-          <w:szCs w:val="20"/>
-        </w:rPr>
-        <w:t xml:space="preserve">  status,</w:t>
-      </w:r>
-    </w:p>
-    <w:p>
-      <w:pPr>
-        <w:spacing w:after="0"/>
-        <w:rPr>
-          <w:i/>
-          <w:iCs/>
-          <w:sz w:val="20"/>
-          <w:szCs w:val="20"/>
-        </w:rPr>
-      </w:pPr>
-      <w:r>
-        <w:rPr>
-          <w:i/>
-          <w:iCs/>
-          <w:sz w:val="20"/>
-          <w:szCs w:val="20"/>
-        </w:rPr>
-        <w:t xml:space="preserve">  </w:t>
-      </w:r>
-      <w:proofErr w:type="spellStart"/>
-      <w:r>
-        <w:rPr>
-          <w:i/>
-          <w:iCs/>
-          <w:sz w:val="20"/>
-          <w:szCs w:val="20"/>
-        </w:rPr>
-        <w:t>created_at</w:t>
-      </w:r>
-      <w:proofErr w:type="spellEnd"/>
-      <w:r>
-        <w:rPr>
-          <w:i/>
-          <w:iCs/>
-          <w:sz w:val="20"/>
-          <w:szCs w:val="20"/>
-        </w:rPr>
-        <w:t>,</w:t>
-      </w:r>
-    </w:p>
-    <w:p>
-      <w:pPr>
-        <w:spacing w:after="0"/>
-        <w:rPr>
-          <w:i/>
-          <w:iCs/>
-          <w:sz w:val="20"/>
-          <w:szCs w:val="20"/>
-        </w:rPr>
-      </w:pPr>
-      <w:r>
-        <w:rPr>
-          <w:i/>
-          <w:iCs/>
-          <w:sz w:val="20"/>
-          <w:szCs w:val="20"/>
-        </w:rPr>
-        <w:t xml:space="preserve">  </w:t>
-      </w:r>
-      <w:proofErr w:type="spellStart"/>
-      <w:r>
-        <w:rPr>
-          <w:i/>
-          <w:iCs/>
-          <w:sz w:val="20"/>
-          <w:szCs w:val="20"/>
-        </w:rPr>
-        <w:t>geom</w:t>
-      </w:r>
-      <w:proofErr w:type="spellEnd"/>
-    </w:p>
-    <w:p>
-      <w:pPr>
-        <w:spacing w:after="0"/>
-        <w:rPr>
-          <w:i/>
-          <w:iCs/>
-          <w:sz w:val="20"/>
-          <w:szCs w:val="20"/>
-        </w:rPr>
-      </w:pPr>
-      <w:r>
-        <w:rPr>
-          <w:i/>
-          <w:iCs/>
-          <w:sz w:val="20"/>
-          <w:szCs w:val="20"/>
-        </w:rPr>
-        <w:t>)</w:t>
-      </w:r>
-    </w:p>
-    <w:p/>
-    <w:p/>
-    <w:p>
-      <w:r>
-        <w:t>ER Diagram (Description)</w:t>
-      </w:r>
-    </w:p>
-    <w:p>
-      <w:pPr>
-        <w:pStyle w:val="ListParagraph"/>
-        <w:numPr>
-          <w:ilvl w:val="0"/>
-          <w:numId w:val="14"/>
-        </w:numPr>
-      </w:pPr>
-      <w:proofErr w:type="gramStart"/>
-      <w:r>
-        <w:t>One park</w:t>
-      </w:r>
-      <w:proofErr w:type="gramEnd"/>
-      <w:r>
-        <w:t xml:space="preserve"> → many trails</w:t>
-      </w:r>
-    </w:p>
-    <w:p>
-      <w:pPr>
-        <w:pStyle w:val="ListParagraph"/>
-        <w:numPr>
-          <w:ilvl w:val="0"/>
-          <w:numId w:val="14"/>
-        </w:numPr>
-      </w:pPr>
-      <w:proofErr w:type="gramStart"/>
-      <w:r>
-        <w:t>One park</w:t>
-      </w:r>
-      <w:proofErr w:type="gramEnd"/>
-      <w:r>
-        <w:t xml:space="preserve"> → many facilities</w:t>
-      </w:r>
-    </w:p>
-    <w:p>
-      <w:pPr>
-        <w:pStyle w:val="ListParagraph"/>
-        <w:numPr>
-          <w:ilvl w:val="0"/>
-          <w:numId w:val="14"/>
-        </w:numPr>
-      </w:pPr>
-      <w:proofErr w:type="gramStart"/>
-      <w:r>
-        <w:t>One park</w:t>
-      </w:r>
-      <w:proofErr w:type="gramEnd"/>
-      <w:r>
-        <w:t xml:space="preserve"> → many reports</w:t>
-      </w:r>
-    </w:p>
-    <w:p>
-      <w:pPr>
-        <w:pStyle w:val="ListParagraph"/>
-        <w:numPr>
-          <w:ilvl w:val="0"/>
-          <w:numId w:val="14"/>
-        </w:numPr>
-      </w:pPr>
-      <w:r>
-        <w:t>Reports linked to spatial locations</w:t>
-      </w:r>
-    </w:p>
-    <w:p>
+      <w:r>
+        <w:t xml:space="preserve">                </w:t>
+      </w:r>
       <w:r>
         <w:rPr>
           <w:noProof/>
         </w:rPr>
         <w:drawing>
-          <wp:inline distT="0" distB="0" distL="0" distR="0" wp14:anchorId="6696C04F" wp14:editId="2BEAC77C">
-            <wp:extent cx="5943600" cy="3714750"/>
+          <wp:inline distT="0" distB="0" distL="0" distR="0" wp14:anchorId="159303DC" wp14:editId="317FA281">
+            <wp:extent cx="2295525" cy="1733929"/>
             <wp:effectExtent l="0" t="0" r="0" b="0"/>
-            <wp:docPr id="1191765638" name="Picture 1"/>
+            <wp:docPr id="35869611" name="Picture 2"/>
             <wp:cNvGraphicFramePr>
               <a:graphicFrameLocks xmlns:a="http://schemas.openxmlformats.org/drawingml/2006/main" noChangeAspect="1"/>
             </wp:cNvGraphicFramePr>
@@ -2117,11 +468,11 @@
               <a:graphicData uri="http://schemas.openxmlformats.org/drawingml/2006/picture">
                 <pic:pic xmlns:pic="http://schemas.openxmlformats.org/drawingml/2006/picture">
                   <pic:nvPicPr>
-                    <pic:cNvPr id="1191765638" name="Picture 1191765638"/>
+                    <pic:cNvPr id="35869611" name="Picture 35869611"/>
                     <pic:cNvPicPr/>
                   </pic:nvPicPr>
                   <pic:blipFill>
-                    <a:blip r:embed="rId5">
+                    <a:blip r:embed="rId5" cstate="print">
                       <a:extLst>
                         <a:ext uri="{28A0092B-C50C-407E-A947-70E740481C1C}">
                           <a14:useLocalDpi xmlns:a14="http://schemas.microsoft.com/office/drawing/2010/main" val="0"/>
@@ -2135,7 +486,7 @@
                   <pic:spPr>
                     <a:xfrm>
                       <a:off x="0" y="0"/>
-                      <a:ext cx="5945104" cy="3715690"/>
+                      <a:ext cx="2301884" cy="1738732"/>
                     </a:xfrm>
                     <a:prstGeom prst="rect">
                       <a:avLst/>
@@ -2150,11 +501,606 @@
     </w:p>
     <w:p>
       <w:pPr>
+        <w:ind w:left="720"/>
+      </w:pPr>
+    </w:p>
+    <w:p>
+      <w:pPr>
+        <w:ind w:left="720"/>
+      </w:pPr>
+      <w:r>
+        <w:t>4. Device Location (Near Me)</w:t>
+      </w:r>
+    </w:p>
+    <w:p>
+      <w:pPr>
+        <w:ind w:left="720"/>
+      </w:pPr>
+      <w:r>
+        <w:t>Users can locate themselves using geolocation and center the map accordingly.</w:t>
+      </w:r>
+    </w:p>
+    <w:p>
+      <w:pPr>
+        <w:ind w:left="720"/>
+      </w:pPr>
+      <w:r>
+        <w:lastRenderedPageBreak/>
+        <w:t>5. Layer Toggle</w:t>
+      </w:r>
+    </w:p>
+    <w:p>
+      <w:r>
+        <w:t xml:space="preserve">                   </w:t>
+      </w:r>
+      <w:r>
+        <w:t>Users can enable/disable:</w:t>
+      </w:r>
+      <w:r>
+        <w:t xml:space="preserve"> </w:t>
+      </w:r>
+      <w:r>
+        <w:t>Trails</w:t>
+      </w:r>
+      <w:r>
+        <w:t xml:space="preserve">, </w:t>
+      </w:r>
+      <w:r>
+        <w:t>Facilities</w:t>
+      </w:r>
+      <w:r>
+        <w:t xml:space="preserve">, </w:t>
+      </w:r>
+      <w:r>
+        <w:t>Parking</w:t>
+      </w:r>
+      <w:r>
+        <w:t xml:space="preserve">, </w:t>
+      </w:r>
+      <w:r>
+        <w:t>Sensitive areas</w:t>
+      </w:r>
+      <w:r>
+        <w:t xml:space="preserve">, </w:t>
+      </w:r>
+      <w:r>
+        <w:t>User reports</w:t>
+      </w:r>
+      <w:r>
+        <w:t>.</w:t>
+      </w:r>
+    </w:p>
+    <w:p>
+      <w:pPr>
+        <w:pStyle w:val="ListParagraph"/>
+      </w:pPr>
+      <w:r>
+        <w:rPr>
+          <w:noProof/>
+        </w:rPr>
+        <w:drawing>
+          <wp:inline distT="0" distB="0" distL="0" distR="0" wp14:anchorId="32C9A931" wp14:editId="6E096382">
+            <wp:extent cx="4033838" cy="2479776"/>
+            <wp:effectExtent l="0" t="0" r="5080" b="0"/>
+            <wp:docPr id="302809194" name="Picture 1"/>
+            <wp:cNvGraphicFramePr>
+              <a:graphicFrameLocks xmlns:a="http://schemas.openxmlformats.org/drawingml/2006/main" noChangeAspect="1"/>
+            </wp:cNvGraphicFramePr>
+            <a:graphic xmlns:a="http://schemas.openxmlformats.org/drawingml/2006/main">
+              <a:graphicData uri="http://schemas.openxmlformats.org/drawingml/2006/picture">
+                <pic:pic xmlns:pic="http://schemas.openxmlformats.org/drawingml/2006/picture">
+                  <pic:nvPicPr>
+                    <pic:cNvPr id="302809194" name="Picture 302809194"/>
+                    <pic:cNvPicPr/>
+                  </pic:nvPicPr>
+                  <pic:blipFill>
+                    <a:blip r:embed="rId6" cstate="print">
+                      <a:extLst>
+                        <a:ext uri="{28A0092B-C50C-407E-A947-70E740481C1C}">
+                          <a14:useLocalDpi xmlns:a14="http://schemas.microsoft.com/office/drawing/2010/main" val="0"/>
+                        </a:ext>
+                      </a:extLst>
+                    </a:blip>
+                    <a:stretch>
+                      <a:fillRect/>
+                    </a:stretch>
+                  </pic:blipFill>
+                  <pic:spPr>
+                    <a:xfrm>
+                      <a:off x="0" y="0"/>
+                      <a:ext cx="4041652" cy="2484579"/>
+                    </a:xfrm>
+                    <a:prstGeom prst="rect">
+                      <a:avLst/>
+                    </a:prstGeom>
+                  </pic:spPr>
+                </pic:pic>
+              </a:graphicData>
+            </a:graphic>
+          </wp:inline>
+        </w:drawing>
+      </w:r>
+    </w:p>
+    <w:p>
+      <w:pPr>
         <w:rPr>
           <w:b/>
           <w:bCs/>
         </w:rPr>
       </w:pPr>
+      <w:r>
+        <w:rPr>
+          <w:b/>
+          <w:bCs/>
+        </w:rPr>
+        <w:t>4. Data Layers</w:t>
+      </w:r>
+    </w:p>
+    <w:p>
+      <w:r>
+        <w:t>The application includes at least 5 layers:</w:t>
+      </w:r>
+    </w:p>
+    <w:p>
+      <w:pPr>
+        <w:pStyle w:val="ListParagraph"/>
+        <w:numPr>
+          <w:ilvl w:val="0"/>
+          <w:numId w:val="5"/>
+        </w:numPr>
+      </w:pPr>
+      <w:r>
+        <w:t>Trails (Line)</w:t>
+      </w:r>
+    </w:p>
+    <w:p>
+      <w:pPr>
+        <w:pStyle w:val="ListParagraph"/>
+        <w:numPr>
+          <w:ilvl w:val="0"/>
+          <w:numId w:val="5"/>
+        </w:numPr>
+      </w:pPr>
+      <w:r>
+        <w:t>Digitized manually for accuracy</w:t>
+      </w:r>
+    </w:p>
+    <w:p>
+      <w:pPr>
+        <w:pStyle w:val="ListParagraph"/>
+        <w:numPr>
+          <w:ilvl w:val="0"/>
+          <w:numId w:val="5"/>
+        </w:numPr>
+      </w:pPr>
+      <w:r>
+        <w:t>Includes attributes: difficulty, surface, length</w:t>
+      </w:r>
+    </w:p>
+    <w:p>
+      <w:pPr>
+        <w:pStyle w:val="ListParagraph"/>
+        <w:numPr>
+          <w:ilvl w:val="0"/>
+          <w:numId w:val="5"/>
+        </w:numPr>
+      </w:pPr>
+      <w:r>
+        <w:t>Facilities (Point/Polygon)</w:t>
+      </w:r>
+    </w:p>
+    <w:p>
+      <w:pPr>
+        <w:pStyle w:val="ListParagraph"/>
+        <w:numPr>
+          <w:ilvl w:val="0"/>
+          <w:numId w:val="5"/>
+        </w:numPr>
+      </w:pPr>
+      <w:r>
+        <w:t>Includes restrooms, visitor centers, playgrounds</w:t>
+      </w:r>
+    </w:p>
+    <w:p>
+      <w:pPr>
+        <w:pStyle w:val="ListParagraph"/>
+        <w:numPr>
+          <w:ilvl w:val="0"/>
+          <w:numId w:val="5"/>
+        </w:numPr>
+      </w:pPr>
+      <w:r>
+        <w:t>Uses custom symbology (icons)</w:t>
+      </w:r>
+    </w:p>
+    <w:p>
+      <w:pPr>
+        <w:pStyle w:val="ListParagraph"/>
+        <w:numPr>
+          <w:ilvl w:val="0"/>
+          <w:numId w:val="5"/>
+        </w:numPr>
+      </w:pPr>
+      <w:r>
+        <w:t>Parking (Polygon)</w:t>
+      </w:r>
+    </w:p>
+    <w:p>
+      <w:pPr>
+        <w:pStyle w:val="ListParagraph"/>
+        <w:numPr>
+          <w:ilvl w:val="0"/>
+          <w:numId w:val="5"/>
+        </w:numPr>
+      </w:pPr>
+      <w:r>
+        <w:t>Represents parking areas with capacity attributes</w:t>
+      </w:r>
+    </w:p>
+    <w:p>
+      <w:pPr>
+        <w:pStyle w:val="ListParagraph"/>
+        <w:numPr>
+          <w:ilvl w:val="0"/>
+          <w:numId w:val="5"/>
+        </w:numPr>
+      </w:pPr>
+      <w:r>
+        <w:t>Sensitive Areas (Polygon)</w:t>
+      </w:r>
+    </w:p>
+    <w:p>
+      <w:pPr>
+        <w:pStyle w:val="ListParagraph"/>
+        <w:numPr>
+          <w:ilvl w:val="0"/>
+          <w:numId w:val="5"/>
+        </w:numPr>
+      </w:pPr>
+      <w:r>
+        <w:t>Includes ecological or restricted zones</w:t>
+      </w:r>
+    </w:p>
+    <w:p>
+      <w:pPr>
+        <w:pStyle w:val="ListParagraph"/>
+        <w:numPr>
+          <w:ilvl w:val="0"/>
+          <w:numId w:val="5"/>
+        </w:numPr>
+      </w:pPr>
+      <w:r>
+        <w:t>User Reports (Point)</w:t>
+      </w:r>
+    </w:p>
+    <w:p>
+      <w:pPr>
+        <w:pStyle w:val="ListParagraph"/>
+        <w:numPr>
+          <w:ilvl w:val="0"/>
+          <w:numId w:val="5"/>
+        </w:numPr>
+      </w:pPr>
+      <w:r>
+        <w:t>User-generated data layer</w:t>
+      </w:r>
+    </w:p>
+    <w:p>
+      <w:pPr>
+        <w:pStyle w:val="ListParagraph"/>
+        <w:numPr>
+          <w:ilvl w:val="0"/>
+          <w:numId w:val="5"/>
+        </w:numPr>
+      </w:pPr>
+      <w:r>
+        <w:t>Basemap (OpenStreetMap)</w:t>
+      </w:r>
+    </w:p>
+    <w:p>
+      <w:pPr>
+        <w:pStyle w:val="ListParagraph"/>
+        <w:numPr>
+          <w:ilvl w:val="0"/>
+          <w:numId w:val="5"/>
+        </w:numPr>
+      </w:pPr>
+      <w:r>
+        <w:t>Provides geographic context</w:t>
+      </w:r>
+    </w:p>
+    <w:p>
+      <w:pPr>
+        <w:rPr>
+          <w:b/>
+          <w:bCs/>
+        </w:rPr>
+      </w:pPr>
+      <w:r>
+        <w:rPr>
+          <w:b/>
+          <w:bCs/>
+        </w:rPr>
+        <w:t>5. Data Collection and Processing</w:t>
+      </w:r>
+    </w:p>
+    <w:p>
+      <w:r>
+        <w:t xml:space="preserve">Initial data was created using approximate </w:t>
+      </w:r>
+      <w:proofErr w:type="spellStart"/>
+      <w:r>
+        <w:t>GeoJSON</w:t>
+      </w:r>
+      <w:proofErr w:type="spellEnd"/>
+      <w:r>
+        <w:t xml:space="preserve"> layers.</w:t>
+      </w:r>
+    </w:p>
+    <w:p>
+      <w:r>
+        <w:t>To improve spatial accuracy, features such as trails, facilities, and parking were:</w:t>
+      </w:r>
+    </w:p>
+    <w:p>
+      <w:pPr>
+        <w:pStyle w:val="ListParagraph"/>
+        <w:numPr>
+          <w:ilvl w:val="0"/>
+          <w:numId w:val="6"/>
+        </w:numPr>
+      </w:pPr>
+      <w:r>
+        <w:lastRenderedPageBreak/>
+        <w:t xml:space="preserve">Digitized manually using </w:t>
+      </w:r>
+      <w:proofErr w:type="spellStart"/>
+      <w:r>
+        <w:t>umap</w:t>
+      </w:r>
+      <w:proofErr w:type="spellEnd"/>
+      <w:r>
+        <w:t xml:space="preserve"> software on </w:t>
+      </w:r>
+      <w:proofErr w:type="spellStart"/>
+      <w:r>
+        <w:t>openstreetmap</w:t>
+      </w:r>
+      <w:proofErr w:type="spellEnd"/>
+      <w:r>
+        <w:t xml:space="preserve"> </w:t>
+      </w:r>
+    </w:p>
+    <w:p>
+      <w:pPr>
+        <w:pStyle w:val="ListParagraph"/>
+        <w:numPr>
+          <w:ilvl w:val="0"/>
+          <w:numId w:val="6"/>
+        </w:numPr>
+      </w:pPr>
+      <w:r>
+        <w:t xml:space="preserve">Cleaned and structured into </w:t>
+      </w:r>
+      <w:proofErr w:type="spellStart"/>
+      <w:r>
+        <w:t>GeoJSON</w:t>
+      </w:r>
+      <w:proofErr w:type="spellEnd"/>
+      <w:r>
+        <w:t xml:space="preserve"> format</w:t>
+      </w:r>
+    </w:p>
+    <w:p>
+      <w:pPr>
+        <w:pStyle w:val="ListParagraph"/>
+        <w:numPr>
+          <w:ilvl w:val="0"/>
+          <w:numId w:val="6"/>
+        </w:numPr>
+      </w:pPr>
+      <w:r>
+        <w:t>Standardized with consistent attributes</w:t>
+      </w:r>
+    </w:p>
+    <w:p>
+      <w:r>
+        <w:t>This significantly improved the realism and usability of the application.</w:t>
+      </w:r>
+    </w:p>
+    <w:p/>
+    <w:p>
+      <w:pPr>
+        <w:rPr>
+          <w:b/>
+          <w:bCs/>
+        </w:rPr>
+      </w:pPr>
+      <w:r>
+        <w:rPr>
+          <w:b/>
+          <w:bCs/>
+        </w:rPr>
+        <w:t>6. Backend Design (ER Diagram &amp; Logical Schema)</w:t>
+      </w:r>
+    </w:p>
+    <w:p>
+      <w:r>
+        <w:t>Although the deployed version runs on GitHub Pages (frontend only), the application is designed to integrate with a backend system using PostgreSQL/</w:t>
+      </w:r>
+      <w:proofErr w:type="spellStart"/>
+      <w:r>
+        <w:t>PostGIS</w:t>
+      </w:r>
+      <w:proofErr w:type="spellEnd"/>
+      <w:r>
+        <w:t>.</w:t>
+      </w:r>
+    </w:p>
+    <w:p>
+      <w:pPr>
+        <w:pStyle w:val="ListParagraph"/>
+        <w:numPr>
+          <w:ilvl w:val="0"/>
+          <w:numId w:val="13"/>
+        </w:numPr>
+      </w:pPr>
+      <w:proofErr w:type="gramStart"/>
+      <w:r>
+        <w:t>Entities</w:t>
+      </w:r>
+      <w:r>
+        <w:t xml:space="preserve"> ,</w:t>
+      </w:r>
+      <w:proofErr w:type="gramEnd"/>
+      <w:r>
+        <w:t xml:space="preserve"> Park, Trail, </w:t>
+      </w:r>
+      <w:r>
+        <w:t>Facility</w:t>
+      </w:r>
+      <w:r>
+        <w:t xml:space="preserve">, </w:t>
+      </w:r>
+      <w:r>
+        <w:t>Parking</w:t>
+      </w:r>
+      <w:r>
+        <w:t xml:space="preserve">, </w:t>
+      </w:r>
+      <w:r>
+        <w:t>Sensitive Area</w:t>
+      </w:r>
+      <w:r>
+        <w:t xml:space="preserve">, </w:t>
+      </w:r>
+      <w:r>
+        <w:t>User Report</w:t>
+      </w:r>
+      <w:r>
+        <w:t xml:space="preserve">, and </w:t>
+      </w:r>
+      <w:r>
+        <w:t xml:space="preserve">Logical Schema </w:t>
+      </w:r>
+    </w:p>
+    <w:p>
+      <w:r>
+        <w:t>ER Diagram (Description)</w:t>
+      </w:r>
+    </w:p>
+    <w:p>
+      <w:pPr>
+        <w:pStyle w:val="ListParagraph"/>
+        <w:numPr>
+          <w:ilvl w:val="0"/>
+          <w:numId w:val="14"/>
+        </w:numPr>
+      </w:pPr>
+      <w:proofErr w:type="gramStart"/>
+      <w:r>
+        <w:t>One park</w:t>
+      </w:r>
+      <w:proofErr w:type="gramEnd"/>
+      <w:r>
+        <w:t xml:space="preserve"> → many trails</w:t>
+      </w:r>
+    </w:p>
+    <w:p>
+      <w:pPr>
+        <w:pStyle w:val="ListParagraph"/>
+        <w:numPr>
+          <w:ilvl w:val="0"/>
+          <w:numId w:val="14"/>
+        </w:numPr>
+      </w:pPr>
+      <w:proofErr w:type="gramStart"/>
+      <w:r>
+        <w:t>One park</w:t>
+      </w:r>
+      <w:proofErr w:type="gramEnd"/>
+      <w:r>
+        <w:t xml:space="preserve"> → many facilities</w:t>
+      </w:r>
+    </w:p>
+    <w:p>
+      <w:pPr>
+        <w:pStyle w:val="ListParagraph"/>
+        <w:numPr>
+          <w:ilvl w:val="0"/>
+          <w:numId w:val="14"/>
+        </w:numPr>
+      </w:pPr>
+      <w:proofErr w:type="gramStart"/>
+      <w:r>
+        <w:t>One park</w:t>
+      </w:r>
+      <w:proofErr w:type="gramEnd"/>
+      <w:r>
+        <w:t xml:space="preserve"> → many reports</w:t>
+      </w:r>
+    </w:p>
+    <w:p>
+      <w:pPr>
+        <w:pStyle w:val="ListParagraph"/>
+        <w:numPr>
+          <w:ilvl w:val="0"/>
+          <w:numId w:val="14"/>
+        </w:numPr>
+      </w:pPr>
+      <w:r>
+        <w:t>Reports linked to spatial locations</w:t>
+      </w:r>
+    </w:p>
+    <w:p>
+      <w:r>
+        <w:rPr>
+          <w:noProof/>
+        </w:rPr>
+        <w:drawing>
+          <wp:inline distT="0" distB="0" distL="0" distR="0" wp14:anchorId="6696C04F" wp14:editId="3FB96FA3">
+            <wp:extent cx="4805363" cy="3003352"/>
+            <wp:effectExtent l="0" t="0" r="0" b="6985"/>
+            <wp:docPr id="1191765638" name="Picture 1"/>
+            <wp:cNvGraphicFramePr>
+              <a:graphicFrameLocks xmlns:a="http://schemas.openxmlformats.org/drawingml/2006/main" noChangeAspect="1"/>
+            </wp:cNvGraphicFramePr>
+            <a:graphic xmlns:a="http://schemas.openxmlformats.org/drawingml/2006/main">
+              <a:graphicData uri="http://schemas.openxmlformats.org/drawingml/2006/picture">
+                <pic:pic xmlns:pic="http://schemas.openxmlformats.org/drawingml/2006/picture">
+                  <pic:nvPicPr>
+                    <pic:cNvPr id="1191765638" name="Picture 1191765638"/>
+                    <pic:cNvPicPr/>
+                  </pic:nvPicPr>
+                  <pic:blipFill>
+                    <a:blip r:embed="rId7">
+                      <a:extLst>
+                        <a:ext uri="{28A0092B-C50C-407E-A947-70E740481C1C}">
+                          <a14:useLocalDpi xmlns:a14="http://schemas.microsoft.com/office/drawing/2010/main" val="0"/>
+                        </a:ext>
+                      </a:extLst>
+                    </a:blip>
+                    <a:stretch>
+                      <a:fillRect/>
+                    </a:stretch>
+                  </pic:blipFill>
+                  <pic:spPr>
+                    <a:xfrm>
+                      <a:off x="0" y="0"/>
+                      <a:ext cx="4811646" cy="3007279"/>
+                    </a:xfrm>
+                    <a:prstGeom prst="rect">
+                      <a:avLst/>
+                    </a:prstGeom>
+                  </pic:spPr>
+                </pic:pic>
+              </a:graphicData>
+            </a:graphic>
+          </wp:inline>
+        </w:drawing>
+      </w:r>
+    </w:p>
+    <w:p>
       <w:r>
         <w:rPr>
           <w:b/>
@@ -2167,108 +1113,66 @@
       <w:r>
         <w:t>Frontend</w:t>
       </w:r>
-    </w:p>
-    <w:p>
-      <w:pPr>
-        <w:pStyle w:val="ListParagraph"/>
-        <w:numPr>
-          <w:ilvl w:val="0"/>
-          <w:numId w:val="7"/>
-        </w:numPr>
-      </w:pPr>
+      <w:r>
+        <w:t xml:space="preserve">: </w:t>
+      </w:r>
       <w:r>
         <w:t>Leaflet.js (mapping)</w:t>
       </w:r>
-    </w:p>
-    <w:p>
-      <w:pPr>
-        <w:pStyle w:val="ListParagraph"/>
-        <w:numPr>
-          <w:ilvl w:val="0"/>
-          <w:numId w:val="7"/>
-        </w:numPr>
-      </w:pPr>
+      <w:r>
+        <w:t xml:space="preserve">, </w:t>
+      </w:r>
+      <w:r>
+        <w:t>HTML/CSS/JavaScript</w:t>
+      </w:r>
+      <w:r>
+        <w:t xml:space="preserve">, </w:t>
+      </w:r>
+      <w:r>
+        <w:t>GitHub Pages deployment</w:t>
+      </w:r>
+    </w:p>
+    <w:p>
+      <w:r>
+        <w:t>Backend</w:t>
+      </w:r>
+      <w:r>
+        <w:t xml:space="preserve">: </w:t>
+      </w:r>
+      <w:r>
+        <w:t>Node.js + Express</w:t>
+      </w:r>
+      <w:r>
+        <w:t xml:space="preserve">(planned), </w:t>
+      </w:r>
+      <w:r>
+        <w:t>PostgreSQL/</w:t>
+      </w:r>
+      <w:proofErr w:type="spellStart"/>
+      <w:r>
+        <w:t>PostGIS</w:t>
+      </w:r>
+      <w:proofErr w:type="spellEnd"/>
+    </w:p>
+    <w:p>
       <w:r>
         <w:lastRenderedPageBreak/>
-        <w:t>HTML/CSS/JavaScript</w:t>
-      </w:r>
-    </w:p>
-    <w:p>
-      <w:pPr>
-        <w:pStyle w:val="ListParagraph"/>
-        <w:numPr>
-          <w:ilvl w:val="0"/>
-          <w:numId w:val="7"/>
-        </w:numPr>
-      </w:pPr>
-      <w:r>
-        <w:t>GitHub Pages deployment</w:t>
-      </w:r>
-    </w:p>
-    <w:p>
-      <w:r>
-        <w:t>Backend (Planned)</w:t>
-      </w:r>
-    </w:p>
-    <w:p>
-      <w:pPr>
-        <w:pStyle w:val="ListParagraph"/>
-        <w:numPr>
-          <w:ilvl w:val="0"/>
-          <w:numId w:val="8"/>
-        </w:numPr>
-      </w:pPr>
-      <w:r>
-        <w:t>Node.js + Express</w:t>
-      </w:r>
-    </w:p>
-    <w:p>
-      <w:pPr>
-        <w:pStyle w:val="ListParagraph"/>
-        <w:numPr>
-          <w:ilvl w:val="0"/>
-          <w:numId w:val="8"/>
-        </w:numPr>
-      </w:pPr>
-      <w:r>
-        <w:t>PostgreSQL/</w:t>
+        <w:t>Data Storage</w:t>
+      </w:r>
+      <w:r>
+        <w:t xml:space="preserve">: </w:t>
       </w:r>
       <w:proofErr w:type="spellStart"/>
       <w:r>
-        <w:t>PostGIS</w:t>
+        <w:t>GeoJSON</w:t>
       </w:r>
       <w:proofErr w:type="spellEnd"/>
-    </w:p>
-    <w:p>
-      <w:r>
-        <w:t>Data Storage</w:t>
-      </w:r>
-    </w:p>
-    <w:p>
-      <w:pPr>
-        <w:pStyle w:val="ListParagraph"/>
-        <w:numPr>
-          <w:ilvl w:val="0"/>
-          <w:numId w:val="9"/>
-        </w:numPr>
-      </w:pPr>
-      <w:proofErr w:type="spellStart"/>
-      <w:r>
-        <w:t>GeoJSON</w:t>
-      </w:r>
-      <w:proofErr w:type="spellEnd"/>
       <w:r>
         <w:t xml:space="preserve"> (current demo)</w:t>
       </w:r>
-    </w:p>
-    <w:p>
-      <w:pPr>
-        <w:pStyle w:val="ListParagraph"/>
-        <w:numPr>
-          <w:ilvl w:val="0"/>
-          <w:numId w:val="9"/>
-        </w:numPr>
-      </w:pPr>
+      <w:r>
+        <w:t xml:space="preserve">, </w:t>
+      </w:r>
       <w:proofErr w:type="spellStart"/>
       <w:r>
         <w:t>PostGIS</w:t>
@@ -2488,25 +1392,21 @@
     </w:p>
     <w:p>
       <w:pPr>
+        <w:pStyle w:val="ListParagraph"/>
+      </w:pPr>
+    </w:p>
+    <w:p>
+      <w:pPr>
         <w:rPr>
           <w:b/>
           <w:bCs/>
         </w:rPr>
       </w:pPr>
-    </w:p>
-    <w:p>
-      <w:pPr>
+      <w:r>
         <w:rPr>
           <w:b/>
           <w:bCs/>
         </w:rPr>
-      </w:pPr>
-      <w:r>
-        <w:rPr>
-          <w:b/>
-          <w:bCs/>
-        </w:rPr>
-        <w:lastRenderedPageBreak/>
         <w:t>10. Conclusion</w:t>
       </w:r>
     </w:p>
@@ -2517,9 +1417,14 @@
     </w:p>
     <w:p>
       <w:r>
+        <w:t>References:</w:t>
+      </w:r>
+    </w:p>
+    <w:p>
+      <w:r>
         <w:t xml:space="preserve">Map link: </w:t>
       </w:r>
-      <w:hyperlink r:id="rId6" w:history="1">
+      <w:hyperlink r:id="rId8" w:history="1">
         <w:r>
           <w:rPr>
             <w:rStyle w:val="Hyperlink"/>
@@ -2528,7 +1433,6 @@
         </w:r>
       </w:hyperlink>
     </w:p>
-    <w:p/>
     <w:sectPr>
       <w:pgSz w:w="12240" w:h="15840"/>
       <w:pgMar w:top="1440" w:right="1440" w:bottom="1440" w:left="1440" w:header="720" w:footer="720" w:gutter="0"/>
@@ -5224,6 +4128,18 @@
       <w:shd w:val="clear" w:color="auto" w:fill="E1DFDD"/>
     </w:rPr>
   </w:style>
+  <w:style w:type="character" w:styleId="FollowedHyperlink">
+    <w:name w:val="FollowedHyperlink"/>
+    <w:basedOn w:val="DefaultParagraphFont"/>
+    <w:uiPriority w:val="99"/>
+    <w:semiHidden/>
+    <w:unhideWhenUsed/>
+    <w:rsid w:val="00814088"/>
+    <w:rPr>
+      <w:color w:val="96607D" w:themeColor="followedHyperlink"/>
+      <w:u w:val="single"/>
+    </w:rPr>
+  </w:style>
 </w:styles>
 </file>
 

</xml_diff>